<commit_message>
Metodologia padrão de análise: guia, quadro com testagem de hipóteses e gráficos, planilha
- Quadro comparativo em três partes: A. cotejo literal; B. testagem das hipóteses
  (limiar fixado antes, critérios e escala de confiança); C. comparação de
  potencialidades entre os cenários A/B/C, com o gráfico de trajetória com limiar e
  o de potencialidades por dimensão (exemplos com dados fictícios).
- Nota técnica: hipóteses em tabela (indicador, sentido, limiar) e conclusão com o
  resultado de cada hipótese, ligadas ao quadro.
- Guia da metodologia (versão 1.0) e planilha de hipóteses e gráficos (gráficos
  nativos do Excel, cores fixas dos cenários testadas para daltonismo).
- Geradores em docs/modelos/gerador; textos do site e do protótipo atualizados.

Co-Authored-By: Claude Opus 5.5 <noreply@anthropic.com>
Claude-Session: https://claude.ai/code/session_019xgzxFHuUdfQmM6KHZGaMU
</commit_message>
<xml_diff>
--- a/docs/modelos/modelo-nota-tecnica.docx
+++ b/docs/modelos/modelo-nota-tecnica.docx
@@ -1422,7 +1422,7 @@
           <w:sz w:val="18"/>
           <w:szCs w:val="18"/>
         </w:rPr>
-        <w:t xml:space="preserve">A análise do cotejo fica aqui, no parecer. O quadro comparativo (documento à parte) traz só a transcrição dos textos, artigo por artigo, sem comentário.</w:t>
+        <w:t xml:space="preserve">A leitura do cotejo fica aqui. O quadro comparativo (documento à parte) traz a transcrição artigo por artigo (parte A), a testagem das hipóteses (parte B) e a comparação de potencialidades com gráficos (parte C).</w:t>
       </w:r>
     </w:p>
     <w:p>
@@ -2537,7 +2537,7 @@
           <w:sz w:val="24"/>
           <w:szCs w:val="24"/>
         </w:rPr>
-        <w:t xml:space="preserve">6. Hipótese</w:t>
+        <w:t xml:space="preserve">6. Hipóteses</w:t>
       </w:r>
     </w:p>
     <w:p>
@@ -2553,7 +2553,7 @@
           <w:sz w:val="18"/>
           <w:szCs w:val="18"/>
         </w:rPr>
-        <w:t xml:space="preserve">3 a 5 linhas. Frase que pode ser confirmada ou derrubada por um indicador.</w:t>
+        <w:t xml:space="preserve">De 1 a 3 hipóteses. Cada uma é uma frase que um indicador pode confirmar ou derrubar, com o limiar escrito antes de olhar o resultado. A testagem fica no quadro comparativo, parte B (e na planilha).</w:t>
       </w:r>
     </w:p>
     <w:p>
@@ -2569,23 +2569,499 @@
           <w:sz w:val="18"/>
           <w:szCs w:val="18"/>
         </w:rPr>
-        <w:t xml:space="preserve">Formato: "Se aprovada, a proposta tende a produzir [efeito], porque [mecanismo]. Indicador: [o que medir], fonte: [onde medir]."</w:t>
-      </w:r>
-    </w:p>
-    <w:p>
-      <w:pPr>
-        <w:spacing w:after="80" w:line="276"/>
-      </w:pPr>
-      <w:r>
-        <w:rPr>
-          <w:rFonts w:ascii="Arial" w:cs="Arial" w:eastAsia="Arial" w:hAnsi="Arial"/>
-          <w:color w:val="4B4B4B"/>
-          <w:sz w:val="21"/>
-          <w:szCs w:val="21"/>
-        </w:rPr>
-        <w:t xml:space="preserve">[Escreva aqui]</w:t>
-      </w:r>
-    </w:p>
+        <w:t xml:space="preserve">Formato: "Se aprovada, a proposta tende a produzir [efeito], porque [mecanismo]."</w:t>
+      </w:r>
+    </w:p>
+    <w:tbl>
+      <w:tblPr>
+        <w:tblW w:type="dxa" w:w="9026"/>
+        <w:tblBorders>
+          <w:top w:val="single" w:color="auto" w:sz="4"/>
+          <w:left w:val="single" w:color="auto" w:sz="4"/>
+          <w:bottom w:val="single" w:color="auto" w:sz="4"/>
+          <w:right w:val="single" w:color="auto" w:sz="4"/>
+          <w:insideH w:val="single" w:color="auto" w:sz="4"/>
+          <w:insideV w:val="single" w:color="auto" w:sz="4"/>
+        </w:tblBorders>
+      </w:tblPr>
+      <w:tblGrid>
+        <w:gridCol w:w="700"/>
+        <w:gridCol w:w="3600"/>
+        <w:gridCol w:w="2100"/>
+        <w:gridCol w:w="1300"/>
+        <w:gridCol w:w="1326"/>
+      </w:tblGrid>
+      <w:tr>
+        <w:trPr>
+          <w:tblHeader/>
+        </w:trPr>
+        <w:tc>
+          <w:tcPr>
+            <w:tcW w:type="dxa" w:w="700"/>
+            <w:tcBorders>
+              <w:top w:val="single" w:color="D5DDD8" w:sz="4"/>
+              <w:left w:val="single" w:color="D5DDD8" w:sz="4"/>
+              <w:bottom w:val="single" w:color="D5DDD8" w:sz="4"/>
+              <w:right w:val="single" w:color="D5DDD8" w:sz="4"/>
+            </w:tcBorders>
+            <w:shd w:fill="EEF6F1" w:color="auto" w:val="clear"/>
+            <w:tcMar>
+              <w:top w:type="dxa" w:w="60"/>
+              <w:left w:type="dxa" w:w="100"/>
+              <w:bottom w:type="dxa" w:w="60"/>
+              <w:right w:type="dxa" w:w="100"/>
+            </w:tcMar>
+          </w:tcPr>
+          <w:p>
+            <w:r>
+              <w:rPr>
+                <w:rFonts w:ascii="Arial" w:cs="Arial" w:eastAsia="Arial" w:hAnsi="Arial"/>
+                <w:b/>
+                <w:bCs/>
+                <w:color w:val="23864F"/>
+                <w:sz w:val="18"/>
+                <w:szCs w:val="18"/>
+              </w:rPr>
+              <w:t xml:space="preserve">Nº</w:t>
+            </w:r>
+          </w:p>
+        </w:tc>
+        <w:tc>
+          <w:tcPr>
+            <w:tcW w:type="dxa" w:w="3600"/>
+            <w:tcBorders>
+              <w:top w:val="single" w:color="D5DDD8" w:sz="4"/>
+              <w:left w:val="single" w:color="D5DDD8" w:sz="4"/>
+              <w:bottom w:val="single" w:color="D5DDD8" w:sz="4"/>
+              <w:right w:val="single" w:color="D5DDD8" w:sz="4"/>
+            </w:tcBorders>
+            <w:shd w:fill="EEF6F1" w:color="auto" w:val="clear"/>
+            <w:tcMar>
+              <w:top w:type="dxa" w:w="60"/>
+              <w:left w:type="dxa" w:w="100"/>
+              <w:bottom w:type="dxa" w:w="60"/>
+              <w:right w:type="dxa" w:w="100"/>
+            </w:tcMar>
+          </w:tcPr>
+          <w:p>
+            <w:r>
+              <w:rPr>
+                <w:rFonts w:ascii="Arial" w:cs="Arial" w:eastAsia="Arial" w:hAnsi="Arial"/>
+                <w:b/>
+                <w:bCs/>
+                <w:color w:val="23864F"/>
+                <w:sz w:val="18"/>
+                <w:szCs w:val="18"/>
+              </w:rPr>
+              <w:t xml:space="preserve">Hipótese</w:t>
+            </w:r>
+          </w:p>
+        </w:tc>
+        <w:tc>
+          <w:tcPr>
+            <w:tcW w:type="dxa" w:w="2100"/>
+            <w:tcBorders>
+              <w:top w:val="single" w:color="D5DDD8" w:sz="4"/>
+              <w:left w:val="single" w:color="D5DDD8" w:sz="4"/>
+              <w:bottom w:val="single" w:color="D5DDD8" w:sz="4"/>
+              <w:right w:val="single" w:color="D5DDD8" w:sz="4"/>
+            </w:tcBorders>
+            <w:shd w:fill="EEF6F1" w:color="auto" w:val="clear"/>
+            <w:tcMar>
+              <w:top w:type="dxa" w:w="60"/>
+              <w:left w:type="dxa" w:w="100"/>
+              <w:bottom w:type="dxa" w:w="60"/>
+              <w:right w:type="dxa" w:w="100"/>
+            </w:tcMar>
+          </w:tcPr>
+          <w:p>
+            <w:r>
+              <w:rPr>
+                <w:rFonts w:ascii="Arial" w:cs="Arial" w:eastAsia="Arial" w:hAnsi="Arial"/>
+                <w:b/>
+                <w:bCs/>
+                <w:color w:val="23864F"/>
+                <w:sz w:val="18"/>
+                <w:szCs w:val="18"/>
+              </w:rPr>
+              <w:t xml:space="preserve">Indicador e fonte</w:t>
+            </w:r>
+          </w:p>
+        </w:tc>
+        <w:tc>
+          <w:tcPr>
+            <w:tcW w:type="dxa" w:w="1300"/>
+            <w:tcBorders>
+              <w:top w:val="single" w:color="D5DDD8" w:sz="4"/>
+              <w:left w:val="single" w:color="D5DDD8" w:sz="4"/>
+              <w:bottom w:val="single" w:color="D5DDD8" w:sz="4"/>
+              <w:right w:val="single" w:color="D5DDD8" w:sz="4"/>
+            </w:tcBorders>
+            <w:shd w:fill="EEF6F1" w:color="auto" w:val="clear"/>
+            <w:tcMar>
+              <w:top w:type="dxa" w:w="60"/>
+              <w:left w:type="dxa" w:w="100"/>
+              <w:bottom w:type="dxa" w:w="60"/>
+              <w:right w:type="dxa" w:w="100"/>
+            </w:tcMar>
+          </w:tcPr>
+          <w:p>
+            <w:r>
+              <w:rPr>
+                <w:rFonts w:ascii="Arial" w:cs="Arial" w:eastAsia="Arial" w:hAnsi="Arial"/>
+                <w:b/>
+                <w:bCs/>
+                <w:color w:val="23864F"/>
+                <w:sz w:val="18"/>
+                <w:szCs w:val="18"/>
+              </w:rPr>
+              <w:t xml:space="preserve">Sentido</w:t>
+            </w:r>
+          </w:p>
+        </w:tc>
+        <w:tc>
+          <w:tcPr>
+            <w:tcW w:type="dxa" w:w="1326"/>
+            <w:tcBorders>
+              <w:top w:val="single" w:color="D5DDD8" w:sz="4"/>
+              <w:left w:val="single" w:color="D5DDD8" w:sz="4"/>
+              <w:bottom w:val="single" w:color="D5DDD8" w:sz="4"/>
+              <w:right w:val="single" w:color="D5DDD8" w:sz="4"/>
+            </w:tcBorders>
+            <w:shd w:fill="EEF6F1" w:color="auto" w:val="clear"/>
+            <w:tcMar>
+              <w:top w:type="dxa" w:w="60"/>
+              <w:left w:type="dxa" w:w="100"/>
+              <w:bottom w:type="dxa" w:w="60"/>
+              <w:right w:type="dxa" w:w="100"/>
+            </w:tcMar>
+          </w:tcPr>
+          <w:p>
+            <w:r>
+              <w:rPr>
+                <w:rFonts w:ascii="Arial" w:cs="Arial" w:eastAsia="Arial" w:hAnsi="Arial"/>
+                <w:b/>
+                <w:bCs/>
+                <w:color w:val="23864F"/>
+                <w:sz w:val="18"/>
+                <w:szCs w:val="18"/>
+              </w:rPr>
+              <w:t xml:space="preserve">Limiar</w:t>
+            </w:r>
+          </w:p>
+        </w:tc>
+      </w:tr>
+      <w:tr>
+        <w:trPr>
+          <w:tblHeader w:val="false"/>
+        </w:trPr>
+        <w:tc>
+          <w:tcPr>
+            <w:tcW w:type="dxa" w:w="700"/>
+            <w:tcBorders>
+              <w:top w:val="single" w:color="D5DDD8" w:sz="4"/>
+              <w:left w:val="single" w:color="D5DDD8" w:sz="4"/>
+              <w:bottom w:val="single" w:color="D5DDD8" w:sz="4"/>
+              <w:right w:val="single" w:color="D5DDD8" w:sz="4"/>
+            </w:tcBorders>
+            <w:tcMar>
+              <w:top w:type="dxa" w:w="60"/>
+              <w:left w:type="dxa" w:w="100"/>
+              <w:bottom w:type="dxa" w:w="60"/>
+              <w:right w:type="dxa" w:w="100"/>
+            </w:tcMar>
+          </w:tcPr>
+          <w:p>
+            <w:r>
+              <w:rPr>
+                <w:rFonts w:ascii="Arial" w:cs="Arial" w:eastAsia="Arial" w:hAnsi="Arial"/>
+                <w:i w:val="false"/>
+                <w:iCs w:val="false"/>
+                <w:color w:val="4B4B4B"/>
+                <w:sz w:val="18"/>
+                <w:szCs w:val="18"/>
+              </w:rPr>
+              <w:t xml:space="preserve">H1</w:t>
+            </w:r>
+          </w:p>
+        </w:tc>
+        <w:tc>
+          <w:tcPr>
+            <w:tcW w:type="dxa" w:w="3600"/>
+            <w:tcBorders>
+              <w:top w:val="single" w:color="D5DDD8" w:sz="4"/>
+              <w:left w:val="single" w:color="D5DDD8" w:sz="4"/>
+              <w:bottom w:val="single" w:color="D5DDD8" w:sz="4"/>
+              <w:right w:val="single" w:color="D5DDD8" w:sz="4"/>
+            </w:tcBorders>
+            <w:tcMar>
+              <w:top w:type="dxa" w:w="60"/>
+              <w:left w:type="dxa" w:w="100"/>
+              <w:bottom w:type="dxa" w:w="60"/>
+              <w:right w:type="dxa" w:w="100"/>
+            </w:tcMar>
+          </w:tcPr>
+          <w:p>
+            <w:r>
+              <w:rPr>
+                <w:rFonts w:ascii="Arial" w:cs="Arial" w:eastAsia="Arial" w:hAnsi="Arial"/>
+                <w:i/>
+                <w:iCs/>
+                <w:color w:val="7A847E"/>
+                <w:sz w:val="18"/>
+                <w:szCs w:val="18"/>
+              </w:rPr>
+              <w:t xml:space="preserve">[Se aprovada, a proposta tende a ... porque ...]</w:t>
+            </w:r>
+          </w:p>
+        </w:tc>
+        <w:tc>
+          <w:tcPr>
+            <w:tcW w:type="dxa" w:w="2100"/>
+            <w:tcBorders>
+              <w:top w:val="single" w:color="D5DDD8" w:sz="4"/>
+              <w:left w:val="single" w:color="D5DDD8" w:sz="4"/>
+              <w:bottom w:val="single" w:color="D5DDD8" w:sz="4"/>
+              <w:right w:val="single" w:color="D5DDD8" w:sz="4"/>
+            </w:tcBorders>
+            <w:tcMar>
+              <w:top w:type="dxa" w:w="60"/>
+              <w:left w:type="dxa" w:w="100"/>
+              <w:bottom w:type="dxa" w:w="60"/>
+              <w:right w:type="dxa" w:w="100"/>
+            </w:tcMar>
+          </w:tcPr>
+          <w:p>
+            <w:r>
+              <w:rPr>
+                <w:rFonts w:ascii="Arial" w:cs="Arial" w:eastAsia="Arial" w:hAnsi="Arial"/>
+                <w:i/>
+                <w:iCs/>
+                <w:color w:val="7A847E"/>
+                <w:sz w:val="18"/>
+                <w:szCs w:val="18"/>
+              </w:rPr>
+              <w:t xml:space="preserve">[O que medir · onde]</w:t>
+            </w:r>
+          </w:p>
+        </w:tc>
+        <w:tc>
+          <w:tcPr>
+            <w:tcW w:type="dxa" w:w="1300"/>
+            <w:tcBorders>
+              <w:top w:val="single" w:color="D5DDD8" w:sz="4"/>
+              <w:left w:val="single" w:color="D5DDD8" w:sz="4"/>
+              <w:bottom w:val="single" w:color="D5DDD8" w:sz="4"/>
+              <w:right w:val="single" w:color="D5DDD8" w:sz="4"/>
+            </w:tcBorders>
+            <w:tcMar>
+              <w:top w:type="dxa" w:w="60"/>
+              <w:left w:type="dxa" w:w="100"/>
+              <w:bottom w:type="dxa" w:w="60"/>
+              <w:right w:type="dxa" w:w="100"/>
+            </w:tcMar>
+          </w:tcPr>
+          <w:p>
+            <w:r>
+              <w:rPr>
+                <w:rFonts w:ascii="Arial" w:cs="Arial" w:eastAsia="Arial" w:hAnsi="Arial"/>
+                <w:i/>
+                <w:iCs/>
+                <w:color w:val="7A847E"/>
+                <w:sz w:val="18"/>
+                <w:szCs w:val="18"/>
+              </w:rPr>
+              <w:t xml:space="preserve">[Aumento/redução]</w:t>
+            </w:r>
+          </w:p>
+        </w:tc>
+        <w:tc>
+          <w:tcPr>
+            <w:tcW w:type="dxa" w:w="1326"/>
+            <w:tcBorders>
+              <w:top w:val="single" w:color="D5DDD8" w:sz="4"/>
+              <w:left w:val="single" w:color="D5DDD8" w:sz="4"/>
+              <w:bottom w:val="single" w:color="D5DDD8" w:sz="4"/>
+              <w:right w:val="single" w:color="D5DDD8" w:sz="4"/>
+            </w:tcBorders>
+            <w:tcMar>
+              <w:top w:type="dxa" w:w="60"/>
+              <w:left w:type="dxa" w:w="100"/>
+              <w:bottom w:type="dxa" w:w="60"/>
+              <w:right w:type="dxa" w:w="100"/>
+            </w:tcMar>
+          </w:tcPr>
+          <w:p>
+            <w:r>
+              <w:rPr>
+                <w:rFonts w:ascii="Arial" w:cs="Arial" w:eastAsia="Arial" w:hAnsi="Arial"/>
+                <w:i/>
+                <w:iCs/>
+                <w:color w:val="7A847E"/>
+                <w:sz w:val="18"/>
+                <w:szCs w:val="18"/>
+              </w:rPr>
+              <w:t xml:space="preserve">[Ex.: +10% em 3 anos]</w:t>
+            </w:r>
+          </w:p>
+        </w:tc>
+      </w:tr>
+      <w:tr>
+        <w:trPr>
+          <w:tblHeader w:val="false"/>
+        </w:trPr>
+        <w:tc>
+          <w:tcPr>
+            <w:tcW w:type="dxa" w:w="700"/>
+            <w:tcBorders>
+              <w:top w:val="single" w:color="D5DDD8" w:sz="4"/>
+              <w:left w:val="single" w:color="D5DDD8" w:sz="4"/>
+              <w:bottom w:val="single" w:color="D5DDD8" w:sz="4"/>
+              <w:right w:val="single" w:color="D5DDD8" w:sz="4"/>
+            </w:tcBorders>
+            <w:tcMar>
+              <w:top w:type="dxa" w:w="60"/>
+              <w:left w:type="dxa" w:w="100"/>
+              <w:bottom w:type="dxa" w:w="60"/>
+              <w:right w:type="dxa" w:w="100"/>
+            </w:tcMar>
+          </w:tcPr>
+          <w:p>
+            <w:r>
+              <w:rPr>
+                <w:rFonts w:ascii="Arial" w:cs="Arial" w:eastAsia="Arial" w:hAnsi="Arial"/>
+                <w:i w:val="false"/>
+                <w:iCs w:val="false"/>
+                <w:color w:val="4B4B4B"/>
+                <w:sz w:val="18"/>
+                <w:szCs w:val="18"/>
+              </w:rPr>
+              <w:t xml:space="preserve">H2</w:t>
+            </w:r>
+          </w:p>
+        </w:tc>
+        <w:tc>
+          <w:tcPr>
+            <w:tcW w:type="dxa" w:w="3600"/>
+            <w:tcBorders>
+              <w:top w:val="single" w:color="D5DDD8" w:sz="4"/>
+              <w:left w:val="single" w:color="D5DDD8" w:sz="4"/>
+              <w:bottom w:val="single" w:color="D5DDD8" w:sz="4"/>
+              <w:right w:val="single" w:color="D5DDD8" w:sz="4"/>
+            </w:tcBorders>
+            <w:tcMar>
+              <w:top w:type="dxa" w:w="60"/>
+              <w:left w:type="dxa" w:w="100"/>
+              <w:bottom w:type="dxa" w:w="60"/>
+              <w:right w:type="dxa" w:w="100"/>
+            </w:tcMar>
+          </w:tcPr>
+          <w:p>
+            <w:r>
+              <w:rPr>
+                <w:rFonts w:ascii="Arial" w:cs="Arial" w:eastAsia="Arial" w:hAnsi="Arial"/>
+                <w:i/>
+                <w:iCs/>
+                <w:color w:val="7A847E"/>
+                <w:sz w:val="18"/>
+                <w:szCs w:val="18"/>
+              </w:rPr>
+              <w:t xml:space="preserve">[Hipótese]</w:t>
+            </w:r>
+          </w:p>
+        </w:tc>
+        <w:tc>
+          <w:tcPr>
+            <w:tcW w:type="dxa" w:w="2100"/>
+            <w:tcBorders>
+              <w:top w:val="single" w:color="D5DDD8" w:sz="4"/>
+              <w:left w:val="single" w:color="D5DDD8" w:sz="4"/>
+              <w:bottom w:val="single" w:color="D5DDD8" w:sz="4"/>
+              <w:right w:val="single" w:color="D5DDD8" w:sz="4"/>
+            </w:tcBorders>
+            <w:tcMar>
+              <w:top w:type="dxa" w:w="60"/>
+              <w:left w:type="dxa" w:w="100"/>
+              <w:bottom w:type="dxa" w:w="60"/>
+              <w:right w:type="dxa" w:w="100"/>
+            </w:tcMar>
+          </w:tcPr>
+          <w:p>
+            <w:r>
+              <w:rPr>
+                <w:rFonts w:ascii="Arial" w:cs="Arial" w:eastAsia="Arial" w:hAnsi="Arial"/>
+                <w:i/>
+                <w:iCs/>
+                <w:color w:val="7A847E"/>
+                <w:sz w:val="18"/>
+                <w:szCs w:val="18"/>
+              </w:rPr>
+              <w:t xml:space="preserve">[Indicador · fonte]</w:t>
+            </w:r>
+          </w:p>
+        </w:tc>
+        <w:tc>
+          <w:tcPr>
+            <w:tcW w:type="dxa" w:w="1300"/>
+            <w:tcBorders>
+              <w:top w:val="single" w:color="D5DDD8" w:sz="4"/>
+              <w:left w:val="single" w:color="D5DDD8" w:sz="4"/>
+              <w:bottom w:val="single" w:color="D5DDD8" w:sz="4"/>
+              <w:right w:val="single" w:color="D5DDD8" w:sz="4"/>
+            </w:tcBorders>
+            <w:tcMar>
+              <w:top w:type="dxa" w:w="60"/>
+              <w:left w:type="dxa" w:w="100"/>
+              <w:bottom w:type="dxa" w:w="60"/>
+              <w:right w:type="dxa" w:w="100"/>
+            </w:tcMar>
+          </w:tcPr>
+          <w:p>
+            <w:r>
+              <w:rPr>
+                <w:rFonts w:ascii="Arial" w:cs="Arial" w:eastAsia="Arial" w:hAnsi="Arial"/>
+                <w:i/>
+                <w:iCs/>
+                <w:color w:val="7A847E"/>
+                <w:sz w:val="18"/>
+                <w:szCs w:val="18"/>
+              </w:rPr>
+              <w:t xml:space="preserve">[Aumento/redução]</w:t>
+            </w:r>
+          </w:p>
+        </w:tc>
+        <w:tc>
+          <w:tcPr>
+            <w:tcW w:type="dxa" w:w="1326"/>
+            <w:tcBorders>
+              <w:top w:val="single" w:color="D5DDD8" w:sz="4"/>
+              <w:left w:val="single" w:color="D5DDD8" w:sz="4"/>
+              <w:bottom w:val="single" w:color="D5DDD8" w:sz="4"/>
+              <w:right w:val="single" w:color="D5DDD8" w:sz="4"/>
+            </w:tcBorders>
+            <w:tcMar>
+              <w:top w:type="dxa" w:w="60"/>
+              <w:left w:type="dxa" w:w="100"/>
+              <w:bottom w:type="dxa" w:w="60"/>
+              <w:right w:type="dxa" w:w="100"/>
+            </w:tcMar>
+          </w:tcPr>
+          <w:p>
+            <w:r>
+              <w:rPr>
+                <w:rFonts w:ascii="Arial" w:cs="Arial" w:eastAsia="Arial" w:hAnsi="Arial"/>
+                <w:i/>
+                <w:iCs/>
+                <w:color w:val="7A847E"/>
+                <w:sz w:val="18"/>
+                <w:szCs w:val="18"/>
+              </w:rPr>
+              <w:t xml:space="preserve">[Limiar]</w:t>
+            </w:r>
+          </w:p>
+        </w:tc>
+      </w:tr>
+    </w:tbl>
     <w:p>
       <w:pPr>
         <w:pStyle w:val="Heading1"/>
@@ -3671,7 +4147,7 @@
           <w:sz w:val="18"/>
           <w:szCs w:val="18"/>
         </w:rPr>
-        <w:t xml:space="preserve">Cada cenário com as premissas escritas e o resultado esperado no indicador da hipótese.</w:t>
+        <w:t xml:space="preserve">Cada cenário com as premissas escritas e o resultado esperado no indicador da H1, no mesmo horizonte (padrão: 5 anos). Os gráficos da comparação ficam no quadro comparativo, parte C.</w:t>
       </w:r>
     </w:p>
     <w:tbl>
@@ -4976,9 +5452,315 @@
           <w:sz w:val="18"/>
           <w:szCs w:val="18"/>
         </w:rPr>
-        <w:t xml:space="preserve">Cerca de 1/4 de página. Responda à hipótese: se sustenta, se sustenta em parte, ou não se sustenta. Justifique a classificação em uma linha.</w:t>
-      </w:r>
-    </w:p>
+        <w:t xml:space="preserve">Cerca de 1/4 de página. Responda a cada hipótese com o resultado da testagem (quadro comparativo, parte B): sustentada, sustentada em parte, não sustentada ou inconclusiva. Depois, justifique o impacto e o caráter em uma linha cada.</w:t>
+      </w:r>
+    </w:p>
+    <w:tbl>
+      <w:tblPr>
+        <w:tblW w:type="dxa" w:w="9026"/>
+        <w:tblBorders>
+          <w:top w:val="single" w:color="auto" w:sz="4"/>
+          <w:left w:val="single" w:color="auto" w:sz="4"/>
+          <w:bottom w:val="single" w:color="auto" w:sz="4"/>
+          <w:right w:val="single" w:color="auto" w:sz="4"/>
+          <w:insideH w:val="single" w:color="auto" w:sz="4"/>
+          <w:insideV w:val="single" w:color="auto" w:sz="4"/>
+        </w:tblBorders>
+      </w:tblPr>
+      <w:tblGrid>
+        <w:gridCol w:w="700"/>
+        <w:gridCol w:w="2600"/>
+        <w:gridCol w:w="5726"/>
+      </w:tblGrid>
+      <w:tr>
+        <w:trPr>
+          <w:tblHeader/>
+        </w:trPr>
+        <w:tc>
+          <w:tcPr>
+            <w:tcW w:type="dxa" w:w="700"/>
+            <w:tcBorders>
+              <w:top w:val="single" w:color="D5DDD8" w:sz="4"/>
+              <w:left w:val="single" w:color="D5DDD8" w:sz="4"/>
+              <w:bottom w:val="single" w:color="D5DDD8" w:sz="4"/>
+              <w:right w:val="single" w:color="D5DDD8" w:sz="4"/>
+            </w:tcBorders>
+            <w:shd w:fill="EEF6F1" w:color="auto" w:val="clear"/>
+            <w:tcMar>
+              <w:top w:type="dxa" w:w="60"/>
+              <w:left w:type="dxa" w:w="100"/>
+              <w:bottom w:type="dxa" w:w="60"/>
+              <w:right w:type="dxa" w:w="100"/>
+            </w:tcMar>
+          </w:tcPr>
+          <w:p>
+            <w:r>
+              <w:rPr>
+                <w:rFonts w:ascii="Arial" w:cs="Arial" w:eastAsia="Arial" w:hAnsi="Arial"/>
+                <w:b/>
+                <w:bCs/>
+                <w:color w:val="23864F"/>
+                <w:sz w:val="18"/>
+                <w:szCs w:val="18"/>
+              </w:rPr>
+              <w:t xml:space="preserve">Nº</w:t>
+            </w:r>
+          </w:p>
+        </w:tc>
+        <w:tc>
+          <w:tcPr>
+            <w:tcW w:type="dxa" w:w="2600"/>
+            <w:tcBorders>
+              <w:top w:val="single" w:color="D5DDD8" w:sz="4"/>
+              <w:left w:val="single" w:color="D5DDD8" w:sz="4"/>
+              <w:bottom w:val="single" w:color="D5DDD8" w:sz="4"/>
+              <w:right w:val="single" w:color="D5DDD8" w:sz="4"/>
+            </w:tcBorders>
+            <w:shd w:fill="EEF6F1" w:color="auto" w:val="clear"/>
+            <w:tcMar>
+              <w:top w:type="dxa" w:w="60"/>
+              <w:left w:type="dxa" w:w="100"/>
+              <w:bottom w:type="dxa" w:w="60"/>
+              <w:right w:type="dxa" w:w="100"/>
+            </w:tcMar>
+          </w:tcPr>
+          <w:p>
+            <w:r>
+              <w:rPr>
+                <w:rFonts w:ascii="Arial" w:cs="Arial" w:eastAsia="Arial" w:hAnsi="Arial"/>
+                <w:b/>
+                <w:bCs/>
+                <w:color w:val="23864F"/>
+                <w:sz w:val="18"/>
+                <w:szCs w:val="18"/>
+              </w:rPr>
+              <w:t xml:space="preserve">Resultado</w:t>
+            </w:r>
+          </w:p>
+        </w:tc>
+        <w:tc>
+          <w:tcPr>
+            <w:tcW w:type="dxa" w:w="5726"/>
+            <w:tcBorders>
+              <w:top w:val="single" w:color="D5DDD8" w:sz="4"/>
+              <w:left w:val="single" w:color="D5DDD8" w:sz="4"/>
+              <w:bottom w:val="single" w:color="D5DDD8" w:sz="4"/>
+              <w:right w:val="single" w:color="D5DDD8" w:sz="4"/>
+            </w:tcBorders>
+            <w:shd w:fill="EEF6F1" w:color="auto" w:val="clear"/>
+            <w:tcMar>
+              <w:top w:type="dxa" w:w="60"/>
+              <w:left w:type="dxa" w:w="100"/>
+              <w:bottom w:type="dxa" w:w="60"/>
+              <w:right w:type="dxa" w:w="100"/>
+            </w:tcMar>
+          </w:tcPr>
+          <w:p>
+            <w:r>
+              <w:rPr>
+                <w:rFonts w:ascii="Arial" w:cs="Arial" w:eastAsia="Arial" w:hAnsi="Arial"/>
+                <w:b/>
+                <w:bCs/>
+                <w:color w:val="23864F"/>
+                <w:sz w:val="18"/>
+                <w:szCs w:val="18"/>
+              </w:rPr>
+              <w:t xml:space="preserve">Por quê (1 linha)</w:t>
+            </w:r>
+          </w:p>
+        </w:tc>
+      </w:tr>
+      <w:tr>
+        <w:trPr>
+          <w:tblHeader w:val="false"/>
+        </w:trPr>
+        <w:tc>
+          <w:tcPr>
+            <w:tcW w:type="dxa" w:w="700"/>
+            <w:tcBorders>
+              <w:top w:val="single" w:color="D5DDD8" w:sz="4"/>
+              <w:left w:val="single" w:color="D5DDD8" w:sz="4"/>
+              <w:bottom w:val="single" w:color="D5DDD8" w:sz="4"/>
+              <w:right w:val="single" w:color="D5DDD8" w:sz="4"/>
+            </w:tcBorders>
+            <w:tcMar>
+              <w:top w:type="dxa" w:w="60"/>
+              <w:left w:type="dxa" w:w="100"/>
+              <w:bottom w:type="dxa" w:w="60"/>
+              <w:right w:type="dxa" w:w="100"/>
+            </w:tcMar>
+          </w:tcPr>
+          <w:p>
+            <w:r>
+              <w:rPr>
+                <w:rFonts w:ascii="Arial" w:cs="Arial" w:eastAsia="Arial" w:hAnsi="Arial"/>
+                <w:i w:val="false"/>
+                <w:iCs w:val="false"/>
+                <w:color w:val="4B4B4B"/>
+                <w:sz w:val="18"/>
+                <w:szCs w:val="18"/>
+              </w:rPr>
+              <w:t xml:space="preserve">H1</w:t>
+            </w:r>
+          </w:p>
+        </w:tc>
+        <w:tc>
+          <w:tcPr>
+            <w:tcW w:type="dxa" w:w="2600"/>
+            <w:tcBorders>
+              <w:top w:val="single" w:color="D5DDD8" w:sz="4"/>
+              <w:left w:val="single" w:color="D5DDD8" w:sz="4"/>
+              <w:bottom w:val="single" w:color="D5DDD8" w:sz="4"/>
+              <w:right w:val="single" w:color="D5DDD8" w:sz="4"/>
+            </w:tcBorders>
+            <w:tcMar>
+              <w:top w:type="dxa" w:w="60"/>
+              <w:left w:type="dxa" w:w="100"/>
+              <w:bottom w:type="dxa" w:w="60"/>
+              <w:right w:type="dxa" w:w="100"/>
+            </w:tcMar>
+          </w:tcPr>
+          <w:p>
+            <w:r>
+              <w:rPr>
+                <w:rFonts w:ascii="Arial" w:cs="Arial" w:eastAsia="Arial" w:hAnsi="Arial"/>
+                <w:i/>
+                <w:iCs/>
+                <w:color w:val="7A847E"/>
+                <w:sz w:val="18"/>
+                <w:szCs w:val="18"/>
+              </w:rPr>
+              <w:t xml:space="preserve">[Sustentada / em parte / não sustentada / inconclusiva]</w:t>
+            </w:r>
+          </w:p>
+        </w:tc>
+        <w:tc>
+          <w:tcPr>
+            <w:tcW w:type="dxa" w:w="5726"/>
+            <w:tcBorders>
+              <w:top w:val="single" w:color="D5DDD8" w:sz="4"/>
+              <w:left w:val="single" w:color="D5DDD8" w:sz="4"/>
+              <w:bottom w:val="single" w:color="D5DDD8" w:sz="4"/>
+              <w:right w:val="single" w:color="D5DDD8" w:sz="4"/>
+            </w:tcBorders>
+            <w:tcMar>
+              <w:top w:type="dxa" w:w="60"/>
+              <w:left w:type="dxa" w:w="100"/>
+              <w:bottom w:type="dxa" w:w="60"/>
+              <w:right w:type="dxa" w:w="100"/>
+            </w:tcMar>
+          </w:tcPr>
+          <w:p>
+            <w:r>
+              <w:rPr>
+                <w:rFonts w:ascii="Arial" w:cs="Arial" w:eastAsia="Arial" w:hAnsi="Arial"/>
+                <w:i/>
+                <w:iCs/>
+                <w:color w:val="7A847E"/>
+                <w:sz w:val="18"/>
+                <w:szCs w:val="18"/>
+              </w:rPr>
+              <w:t xml:space="preserve">[Evidência decisiva e confiança]</w:t>
+            </w:r>
+          </w:p>
+        </w:tc>
+      </w:tr>
+      <w:tr>
+        <w:trPr>
+          <w:tblHeader w:val="false"/>
+        </w:trPr>
+        <w:tc>
+          <w:tcPr>
+            <w:tcW w:type="dxa" w:w="700"/>
+            <w:tcBorders>
+              <w:top w:val="single" w:color="D5DDD8" w:sz="4"/>
+              <w:left w:val="single" w:color="D5DDD8" w:sz="4"/>
+              <w:bottom w:val="single" w:color="D5DDD8" w:sz="4"/>
+              <w:right w:val="single" w:color="D5DDD8" w:sz="4"/>
+            </w:tcBorders>
+            <w:tcMar>
+              <w:top w:type="dxa" w:w="60"/>
+              <w:left w:type="dxa" w:w="100"/>
+              <w:bottom w:type="dxa" w:w="60"/>
+              <w:right w:type="dxa" w:w="100"/>
+            </w:tcMar>
+          </w:tcPr>
+          <w:p>
+            <w:r>
+              <w:rPr>
+                <w:rFonts w:ascii="Arial" w:cs="Arial" w:eastAsia="Arial" w:hAnsi="Arial"/>
+                <w:i w:val="false"/>
+                <w:iCs w:val="false"/>
+                <w:color w:val="4B4B4B"/>
+                <w:sz w:val="18"/>
+                <w:szCs w:val="18"/>
+              </w:rPr>
+              <w:t xml:space="preserve">H2</w:t>
+            </w:r>
+          </w:p>
+        </w:tc>
+        <w:tc>
+          <w:tcPr>
+            <w:tcW w:type="dxa" w:w="2600"/>
+            <w:tcBorders>
+              <w:top w:val="single" w:color="D5DDD8" w:sz="4"/>
+              <w:left w:val="single" w:color="D5DDD8" w:sz="4"/>
+              <w:bottom w:val="single" w:color="D5DDD8" w:sz="4"/>
+              <w:right w:val="single" w:color="D5DDD8" w:sz="4"/>
+            </w:tcBorders>
+            <w:tcMar>
+              <w:top w:type="dxa" w:w="60"/>
+              <w:left w:type="dxa" w:w="100"/>
+              <w:bottom w:type="dxa" w:w="60"/>
+              <w:right w:type="dxa" w:w="100"/>
+            </w:tcMar>
+          </w:tcPr>
+          <w:p>
+            <w:r>
+              <w:rPr>
+                <w:rFonts w:ascii="Arial" w:cs="Arial" w:eastAsia="Arial" w:hAnsi="Arial"/>
+                <w:i/>
+                <w:iCs/>
+                <w:color w:val="7A847E"/>
+                <w:sz w:val="18"/>
+                <w:szCs w:val="18"/>
+              </w:rPr>
+              <w:t xml:space="preserve">[Resultado]</w:t>
+            </w:r>
+          </w:p>
+        </w:tc>
+        <w:tc>
+          <w:tcPr>
+            <w:tcW w:type="dxa" w:w="5726"/>
+            <w:tcBorders>
+              <w:top w:val="single" w:color="D5DDD8" w:sz="4"/>
+              <w:left w:val="single" w:color="D5DDD8" w:sz="4"/>
+              <w:bottom w:val="single" w:color="D5DDD8" w:sz="4"/>
+              <w:right w:val="single" w:color="D5DDD8" w:sz="4"/>
+            </w:tcBorders>
+            <w:tcMar>
+              <w:top w:type="dxa" w:w="60"/>
+              <w:left w:type="dxa" w:w="100"/>
+              <w:bottom w:type="dxa" w:w="60"/>
+              <w:right w:type="dxa" w:w="100"/>
+            </w:tcMar>
+          </w:tcPr>
+          <w:p>
+            <w:r>
+              <w:rPr>
+                <w:rFonts w:ascii="Arial" w:cs="Arial" w:eastAsia="Arial" w:hAnsi="Arial"/>
+                <w:i/>
+                <w:iCs/>
+                <w:color w:val="7A847E"/>
+                <w:sz w:val="18"/>
+                <w:szCs w:val="18"/>
+              </w:rPr>
+              <w:t xml:space="preserve">[Por quê]</w:t>
+            </w:r>
+          </w:p>
+        </w:tc>
+      </w:tr>
+    </w:tbl>
     <w:p>
       <w:pPr>
         <w:spacing w:after="80" w:line="276"/>
@@ -4990,7 +5772,7 @@
           <w:sz w:val="21"/>
           <w:szCs w:val="21"/>
         </w:rPr>
-        <w:t xml:space="preserve">[Escreva aqui]</w:t>
+        <w:t xml:space="preserve">[Conclusão]</w:t>
       </w:r>
     </w:p>
     <w:p>

</xml_diff>